<commit_message>
Changed Repo name in doc
</commit_message>
<xml_diff>
--- a/Readme.docx
+++ b/Readme.docx
@@ -121,7 +121,6 @@
           <w:szCs w:val="24"/>
         </w:rPr>
       </w:pPr>
-      <w:proofErr w:type="spellStart"/>
       <w:r>
         <w:rPr>
           <w:rFonts w:ascii="Times New Roman" w:eastAsia="Times New Roman" w:hAnsi="Times New Roman" w:cs="Times New Roman"/>
@@ -132,7 +131,6 @@
         </w:rPr>
         <w:t>TestClient</w:t>
       </w:r>
-      <w:proofErr w:type="spellEnd"/>
       <w:r>
         <w:rPr>
           <w:rFonts w:ascii="Times New Roman" w:eastAsia="Times New Roman" w:hAnsi="Times New Roman" w:cs="Times New Roman"/>
@@ -141,7 +139,6 @@
         </w:rPr>
         <w:t xml:space="preserve"> calls </w:t>
       </w:r>
-      <w:proofErr w:type="spellStart"/>
       <w:r>
         <w:rPr>
           <w:rFonts w:ascii="Times New Roman" w:eastAsia="Times New Roman" w:hAnsi="Times New Roman" w:cs="Times New Roman"/>
@@ -152,32 +149,13 @@
         </w:rPr>
         <w:t>LendingService</w:t>
       </w:r>
-      <w:proofErr w:type="spellEnd"/>
-      <w:r>
-        <w:rPr>
-          <w:rFonts w:ascii="Times New Roman" w:eastAsia="Times New Roman" w:hAnsi="Times New Roman" w:cs="Times New Roman"/>
-          <w:sz w:val="24"/>
-          <w:szCs w:val="24"/>
-        </w:rPr>
-        <w:t xml:space="preserve"> via </w:t>
-      </w:r>
-      <w:proofErr w:type="spellStart"/>
-      <w:r>
-        <w:rPr>
-          <w:rFonts w:ascii="Times New Roman" w:eastAsia="Times New Roman" w:hAnsi="Times New Roman" w:cs="Times New Roman"/>
-          <w:sz w:val="24"/>
-          <w:szCs w:val="24"/>
-        </w:rPr>
-        <w:t>gRPC</w:t>
-      </w:r>
-      <w:proofErr w:type="spellEnd"/>
-      <w:r>
-        <w:rPr>
-          <w:rFonts w:ascii="Times New Roman" w:eastAsia="Times New Roman" w:hAnsi="Times New Roman" w:cs="Times New Roman"/>
-          <w:sz w:val="24"/>
-          <w:szCs w:val="24"/>
-        </w:rPr>
-        <w:t>:</w:t>
+      <w:r>
+        <w:rPr>
+          <w:rFonts w:ascii="Times New Roman" w:eastAsia="Times New Roman" w:hAnsi="Times New Roman" w:cs="Times New Roman"/>
+          <w:sz w:val="24"/>
+          <w:szCs w:val="24"/>
+        </w:rPr>
+        <w:t xml:space="preserve"> via gRPC:</w:t>
       </w:r>
     </w:p>
     <w:p>
@@ -215,7 +193,6 @@
           <w:szCs w:val="24"/>
         </w:rPr>
       </w:pPr>
-      <w:proofErr w:type="spellStart"/>
       <w:r>
         <w:rPr>
           <w:rFonts w:ascii="Times New Roman" w:eastAsia="Times New Roman" w:hAnsi="Times New Roman" w:cs="Times New Roman"/>
@@ -226,7 +203,6 @@
         </w:rPr>
         <w:t>LendingService</w:t>
       </w:r>
-      <w:proofErr w:type="spellEnd"/>
       <w:r>
         <w:rPr>
           <w:rFonts w:ascii="Times New Roman" w:eastAsia="Times New Roman" w:hAnsi="Times New Roman" w:cs="Times New Roman"/>
@@ -275,7 +251,6 @@
         </w:rPr>
         <w:t xml:space="preserve">Calls </w:t>
       </w:r>
-      <w:proofErr w:type="spellStart"/>
       <w:r>
         <w:rPr>
           <w:rFonts w:ascii="Times New Roman" w:eastAsia="Times New Roman" w:hAnsi="Times New Roman" w:cs="Times New Roman"/>
@@ -286,7 +261,6 @@
         </w:rPr>
         <w:t>BookService</w:t>
       </w:r>
-      <w:proofErr w:type="spellEnd"/>
       <w:r>
         <w:rPr>
           <w:rFonts w:ascii="Times New Roman" w:eastAsia="Times New Roman" w:hAnsi="Times New Roman" w:cs="Times New Roman"/>
@@ -295,7 +269,6 @@
         </w:rPr>
         <w:t xml:space="preserve"> to fetch book titles and details (</w:t>
       </w:r>
-      <w:proofErr w:type="spellStart"/>
       <w:r>
         <w:rPr>
           <w:rFonts w:ascii="Times New Roman" w:eastAsia="Times New Roman" w:hAnsi="Times New Roman" w:cs="Times New Roman"/>
@@ -304,7 +277,6 @@
         </w:rPr>
         <w:t>GetBookAsync</w:t>
       </w:r>
-      <w:proofErr w:type="spellEnd"/>
       <w:r>
         <w:rPr>
           <w:rFonts w:ascii="Times New Roman" w:eastAsia="Times New Roman" w:hAnsi="Times New Roman" w:cs="Times New Roman"/>
@@ -335,7 +307,6 @@
         </w:rPr>
         <w:t xml:space="preserve">Calls </w:t>
       </w:r>
-      <w:proofErr w:type="spellStart"/>
       <w:r>
         <w:rPr>
           <w:rFonts w:ascii="Times New Roman" w:eastAsia="Times New Roman" w:hAnsi="Times New Roman" w:cs="Times New Roman"/>
@@ -346,7 +317,6 @@
         </w:rPr>
         <w:t>UserService</w:t>
       </w:r>
-      <w:proofErr w:type="spellEnd"/>
       <w:r>
         <w:rPr>
           <w:rFonts w:ascii="Times New Roman" w:eastAsia="Times New Roman" w:hAnsi="Times New Roman" w:cs="Times New Roman"/>
@@ -355,7 +325,6 @@
         </w:rPr>
         <w:t xml:space="preserve"> to fetch top borrowers (</w:t>
       </w:r>
-      <w:proofErr w:type="spellStart"/>
       <w:r>
         <w:rPr>
           <w:rFonts w:ascii="Times New Roman" w:eastAsia="Times New Roman" w:hAnsi="Times New Roman" w:cs="Times New Roman"/>
@@ -364,7 +333,6 @@
         </w:rPr>
         <w:t>GetTopBorrowingUsersAsync</w:t>
       </w:r>
-      <w:proofErr w:type="spellEnd"/>
       <w:r>
         <w:rPr>
           <w:rFonts w:ascii="Times New Roman" w:eastAsia="Times New Roman" w:hAnsi="Times New Roman" w:cs="Times New Roman"/>
@@ -409,7 +377,6 @@
           <w:szCs w:val="24"/>
         </w:rPr>
       </w:pPr>
-      <w:proofErr w:type="spellStart"/>
       <w:r>
         <w:rPr>
           <w:rFonts w:ascii="Times New Roman" w:eastAsia="Times New Roman" w:hAnsi="Times New Roman" w:cs="Times New Roman"/>
@@ -420,7 +387,6 @@
         </w:rPr>
         <w:t>BookService</w:t>
       </w:r>
-      <w:proofErr w:type="spellEnd"/>
       <w:r>
         <w:rPr>
           <w:rFonts w:ascii="Times New Roman" w:eastAsia="Times New Roman" w:hAnsi="Times New Roman" w:cs="Times New Roman"/>
@@ -443,7 +409,6 @@
           <w:szCs w:val="24"/>
         </w:rPr>
       </w:pPr>
-      <w:proofErr w:type="spellStart"/>
       <w:r>
         <w:rPr>
           <w:rFonts w:ascii="Times New Roman" w:eastAsia="Times New Roman" w:hAnsi="Times New Roman" w:cs="Times New Roman"/>
@@ -452,25 +417,14 @@
         </w:rPr>
         <w:t>GetBook</w:t>
       </w:r>
-      <w:proofErr w:type="spellEnd"/>
-      <w:r>
-        <w:rPr>
-          <w:rFonts w:ascii="Times New Roman" w:eastAsia="Times New Roman" w:hAnsi="Times New Roman" w:cs="Times New Roman"/>
-          <w:sz w:val="24"/>
-          <w:szCs w:val="24"/>
-        </w:rPr>
-        <w:t xml:space="preserve"> by </w:t>
-      </w:r>
-      <w:proofErr w:type="spellStart"/>
-      <w:r>
-        <w:rPr>
-          <w:rFonts w:ascii="Times New Roman" w:eastAsia="Times New Roman" w:hAnsi="Times New Roman" w:cs="Times New Roman"/>
-          <w:sz w:val="24"/>
-          <w:szCs w:val="24"/>
-        </w:rPr>
-        <w:t>BookId</w:t>
-      </w:r>
-      <w:proofErr w:type="spellEnd"/>
+      <w:r>
+        <w:rPr>
+          <w:rFonts w:ascii="Times New Roman" w:eastAsia="Times New Roman" w:hAnsi="Times New Roman" w:cs="Times New Roman"/>
+          <w:sz w:val="24"/>
+          <w:szCs w:val="24"/>
+        </w:rPr>
+        <w:t xml:space="preserve"> by BookId</w:t>
+      </w:r>
     </w:p>
     <w:p>
       <w:pPr>
@@ -485,7 +439,6 @@
           <w:szCs w:val="24"/>
         </w:rPr>
       </w:pPr>
-      <w:proofErr w:type="spellStart"/>
       <w:r>
         <w:rPr>
           <w:rFonts w:ascii="Times New Roman" w:eastAsia="Times New Roman" w:hAnsi="Times New Roman" w:cs="Times New Roman"/>
@@ -496,7 +449,6 @@
         </w:rPr>
         <w:t>UserService</w:t>
       </w:r>
-      <w:proofErr w:type="spellEnd"/>
       <w:r>
         <w:rPr>
           <w:rFonts w:ascii="Times New Roman" w:eastAsia="Times New Roman" w:hAnsi="Times New Roman" w:cs="Times New Roman"/>
@@ -519,7 +471,6 @@
           <w:szCs w:val="24"/>
         </w:rPr>
       </w:pPr>
-      <w:proofErr w:type="spellStart"/>
       <w:r>
         <w:rPr>
           <w:rFonts w:ascii="Times New Roman" w:eastAsia="Times New Roman" w:hAnsi="Times New Roman" w:cs="Times New Roman"/>
@@ -528,7 +479,6 @@
         </w:rPr>
         <w:t>GetUserById</w:t>
       </w:r>
-      <w:proofErr w:type="spellEnd"/>
       <w:r>
         <w:rPr>
           <w:rFonts w:ascii="Times New Roman" w:eastAsia="Times New Roman" w:hAnsi="Times New Roman" w:cs="Times New Roman"/>
@@ -537,7 +487,6 @@
         </w:rPr>
         <w:t xml:space="preserve"> and </w:t>
       </w:r>
-      <w:proofErr w:type="spellStart"/>
       <w:r>
         <w:rPr>
           <w:rFonts w:ascii="Times New Roman" w:eastAsia="Times New Roman" w:hAnsi="Times New Roman" w:cs="Times New Roman"/>
@@ -546,7 +495,6 @@
         </w:rPr>
         <w:t>GetTopBorrowingUsers</w:t>
       </w:r>
-      <w:proofErr w:type="spellEnd"/>
     </w:p>
     <w:p>
       <w:pPr>
@@ -561,7 +509,6 @@
           <w:szCs w:val="24"/>
         </w:rPr>
       </w:pPr>
-      <w:proofErr w:type="spellStart"/>
       <w:r>
         <w:rPr>
           <w:rFonts w:ascii="Times New Roman" w:eastAsia="Times New Roman" w:hAnsi="Times New Roman" w:cs="Times New Roman"/>
@@ -572,7 +519,6 @@
         </w:rPr>
         <w:t>LendingService</w:t>
       </w:r>
-      <w:proofErr w:type="spellEnd"/>
       <w:r>
         <w:rPr>
           <w:rFonts w:ascii="Times New Roman" w:eastAsia="Times New Roman" w:hAnsi="Times New Roman" w:cs="Times New Roman"/>
@@ -581,7 +527,6 @@
         </w:rPr>
         <w:t xml:space="preserve"> compiles results and sends response back to </w:t>
       </w:r>
-      <w:proofErr w:type="spellStart"/>
       <w:r>
         <w:rPr>
           <w:rFonts w:ascii="Times New Roman" w:eastAsia="Times New Roman" w:hAnsi="Times New Roman" w:cs="Times New Roman"/>
@@ -592,7 +537,6 @@
         </w:rPr>
         <w:t>TestClient</w:t>
       </w:r>
-      <w:proofErr w:type="spellEnd"/>
       <w:r>
         <w:rPr>
           <w:rFonts w:ascii="Times New Roman" w:eastAsia="Times New Roman" w:hAnsi="Times New Roman" w:cs="Times New Roman"/>
@@ -657,9 +601,12 @@
           <w:numId w:val="1"/>
         </w:numPr>
         <w:rPr>
-          <w:rFonts w:ascii="Times New Roman" w:hAnsi="Times New Roman" w:cs="Times New Roman"/>
-          <w:sz w:val="24"/>
-          <w:szCs w:val="24"/>
+          <w:rStyle w:val="Hyperlink"/>
+          <w:rFonts w:ascii="Times New Roman" w:hAnsi="Times New Roman" w:cs="Times New Roman"/>
+          <w:color w:val="auto"/>
+          <w:sz w:val="24"/>
+          <w:szCs w:val="24"/>
+          <w:u w:val="none"/>
         </w:rPr>
       </w:pPr>
       <w:r>
@@ -702,6 +649,8 @@
         </w:rPr>
         <w:t xml:space="preserve">– </w:t>
       </w:r>
+      <w:bookmarkStart w:id="0" w:name="_GoBack"/>
+      <w:bookmarkEnd w:id="0"/>
     </w:p>
     <w:p>
       <w:pPr>
@@ -720,9 +669,19 @@
             <w:sz w:val="24"/>
             <w:szCs w:val="24"/>
           </w:rPr>
-          <w:t>https://github.com/fayejitendra/Library</w:t>
+          <w:t>https://github.com/fayejitendra/LibraryAPISystem</w:t>
         </w:r>
       </w:hyperlink>
+    </w:p>
+    <w:p>
+      <w:pPr>
+        <w:ind w:left="720"/>
+        <w:rPr>
+          <w:rFonts w:ascii="Times New Roman" w:hAnsi="Times New Roman" w:cs="Times New Roman"/>
+          <w:sz w:val="24"/>
+          <w:szCs w:val="24"/>
+        </w:rPr>
+      </w:pPr>
     </w:p>
     <w:p>
       <w:pPr>
@@ -762,7 +721,6 @@
         </w:rPr>
         <w:t xml:space="preserve">for Book, Lending and User service in </w:t>
       </w:r>
-      <w:proofErr w:type="spellStart"/>
       <w:r>
         <w:rPr>
           <w:rFonts w:ascii="Times New Roman" w:hAnsi="Times New Roman" w:cs="Times New Roman"/>
@@ -772,7 +730,6 @@
         </w:rPr>
         <w:t>appsetting.json</w:t>
       </w:r>
-      <w:proofErr w:type="spellEnd"/>
       <w:r>
         <w:rPr>
           <w:rFonts w:ascii="Times New Roman" w:hAnsi="Times New Roman" w:cs="Times New Roman"/>
@@ -805,29 +762,7 @@
           <w:szCs w:val="24"/>
           <w:highlight w:val="white"/>
         </w:rPr>
-        <w:t>"</w:t>
-      </w:r>
-      <w:proofErr w:type="spellStart"/>
-      <w:r>
-        <w:rPr>
-          <w:rFonts w:ascii="Times New Roman" w:hAnsi="Times New Roman" w:cs="Times New Roman"/>
-          <w:color w:val="2E75B6"/>
-          <w:sz w:val="24"/>
-          <w:szCs w:val="24"/>
-          <w:highlight w:val="white"/>
-        </w:rPr>
-        <w:t>ConnectionStrings</w:t>
-      </w:r>
-      <w:proofErr w:type="spellEnd"/>
-      <w:r>
-        <w:rPr>
-          <w:rFonts w:ascii="Times New Roman" w:hAnsi="Times New Roman" w:cs="Times New Roman"/>
-          <w:color w:val="2E75B6"/>
-          <w:sz w:val="24"/>
-          <w:szCs w:val="24"/>
-          <w:highlight w:val="white"/>
-        </w:rPr>
-        <w:t>"</w:t>
+        <w:t>"ConnectionStrings"</w:t>
       </w:r>
       <w:r>
         <w:rPr>
@@ -873,29 +808,7 @@
           <w:szCs w:val="24"/>
           <w:highlight w:val="white"/>
         </w:rPr>
-        <w:t>"</w:t>
-      </w:r>
-      <w:proofErr w:type="spellStart"/>
-      <w:r>
-        <w:rPr>
-          <w:rFonts w:ascii="Times New Roman" w:hAnsi="Times New Roman" w:cs="Times New Roman"/>
-          <w:color w:val="2E75B6"/>
-          <w:sz w:val="24"/>
-          <w:szCs w:val="24"/>
-          <w:highlight w:val="white"/>
-        </w:rPr>
-        <w:t>DefaultConnection</w:t>
-      </w:r>
-      <w:proofErr w:type="spellEnd"/>
-      <w:r>
-        <w:rPr>
-          <w:rFonts w:ascii="Times New Roman" w:hAnsi="Times New Roman" w:cs="Times New Roman"/>
-          <w:color w:val="2E75B6"/>
-          <w:sz w:val="24"/>
-          <w:szCs w:val="24"/>
-          <w:highlight w:val="white"/>
-        </w:rPr>
-        <w:t>"</w:t>
+        <w:t>"DefaultConnection"</w:t>
       </w:r>
       <w:r>
         <w:rPr>
@@ -1263,8 +1176,6 @@
       <w:pPr>
         <w:jc w:val="right"/>
       </w:pPr>
-      <w:bookmarkStart w:id="0" w:name="_GoBack"/>
-      <w:bookmarkEnd w:id="0"/>
       <w:r>
         <w:rPr>
           <w:noProof/>

</xml_diff>